<commit_message>
Update GDC Ian Chains Baute DOCX
Replace the official docs/Official/25-26_GDC_Ian_Chains_Baute_6ICWE.docx file with an updated binary .docx. The change updates the document contents; no textual diff is available due to the binary format.
</commit_message>
<xml_diff>
--- a/docs/Official/25-26_GDC_Ian_Chains_Baute_6ICWE.docx
+++ b/docs/Official/25-26_GDC_Ian_Chains_Baute_6ICWE.docx
@@ -18,7 +18,7 @@
           <w:noProof/>
         </w:rPr>
         <w:drawing>
-          <wp:anchor distT="0" distB="0" distL="114300" distR="114300" simplePos="0" relativeHeight="251658240" behindDoc="0" locked="0" layoutInCell="1" allowOverlap="1" wp14:anchorId="5268361A" wp14:editId="7979F1CD">
+          <wp:anchor distT="0" distB="0" distL="114300" distR="114300" simplePos="0" relativeHeight="251658240" behindDoc="0" locked="0" layoutInCell="1" allowOverlap="1" wp14:anchorId="5268361A" wp14:editId="71B8849A">
             <wp:simplePos x="0" y="0"/>
             <wp:positionH relativeFrom="margin">
               <wp:align>center</wp:align>
@@ -3056,57 +3056,9 @@
     <w:p>
       <w:pPr>
         <w:pStyle w:val="afkorting"/>
-        <w:rPr>
-          <w:lang w:val="en-US"/>
-        </w:rPr>
-      </w:pPr>
-      <w:r>
-        <w:rPr>
-          <w:lang w:val="en-US"/>
-        </w:rPr>
-        <w:t>----authN</w:t>
-      </w:r>
-      <w:r>
-        <w:rPr>
-          <w:lang w:val="en-US"/>
-        </w:rPr>
-        <w:tab/>
-      </w:r>
-      <w:r>
-        <w:rPr>
-          <w:lang w:val="en-US"/>
-        </w:rPr>
-        <w:tab/>
-        <w:t>Authentication (Authenticatie)</w:t>
-      </w:r>
-    </w:p>
-    <w:p>
-      <w:pPr>
-        <w:pStyle w:val="afkorting"/>
-      </w:pPr>
-      <w:r>
-        <w:t>-----a</w:t>
-      </w:r>
-      <w:r>
-        <w:t>uthZ</w:t>
-      </w:r>
-      <w:r>
-        <w:tab/>
-      </w:r>
-      <w:r>
-        <w:tab/>
-        <w:t>Authorization (Autorisatie)</w:t>
-      </w:r>
-    </w:p>
-    <w:p>
-      <w:pPr>
-        <w:pStyle w:val="afkorting"/>
       </w:pPr>
       <w:r>
         <w:t>UID</w:t>
-      </w:r>
-      <w:r>
-        <w:tab/>
       </w:r>
       <w:r>
         <w:tab/>
@@ -3503,7 +3455,7 @@
           <w:noProof/>
         </w:rPr>
         <w:drawing>
-          <wp:anchor distT="0" distB="0" distL="114300" distR="114300" simplePos="0" relativeHeight="251660288" behindDoc="0" locked="0" layoutInCell="1" allowOverlap="1" wp14:anchorId="152C802A" wp14:editId="315DE07D">
+          <wp:anchor distT="0" distB="0" distL="114300" distR="114300" simplePos="0" relativeHeight="251660288" behindDoc="0" locked="0" layoutInCell="1" allowOverlap="1" wp14:anchorId="152C802A" wp14:editId="2B0B75F2">
             <wp:simplePos x="0" y="0"/>
             <wp:positionH relativeFrom="margin">
               <wp:align>left</wp:align>
@@ -4651,10 +4603,7 @@
         <w:t xml:space="preserve"> zijn.</w:t>
       </w:r>
       <w:r>
-        <w:t xml:space="preserve"> </w:t>
-      </w:r>
-      <w:r>
-        <w:t xml:space="preserve">Als er niet wordt voldaan aan de SOP dan wordt de data van de </w:t>
+        <w:t xml:space="preserve"> Als er niet wordt voldaan aan de SOP dan wordt de data van de </w:t>
       </w:r>
       <w:r>
         <w:t xml:space="preserve">API </w:t>
@@ -4872,13 +4821,19 @@
         <w:t xml:space="preserve">directe </w:t>
       </w:r>
       <w:r>
-        <w:t xml:space="preserve">input </w:t>
-      </w:r>
-      <w:r>
-        <w:t xml:space="preserve">en </w:t>
-      </w:r>
-      <w:r>
-        <w:t xml:space="preserve">gegevens van de </w:t>
+        <w:t>input</w:t>
+      </w:r>
+      <w:r>
+        <w:t xml:space="preserve">, </w:t>
+      </w:r>
+      <w:r>
+        <w:t xml:space="preserve">gegevens </w:t>
+      </w:r>
+      <w:r>
+        <w:t xml:space="preserve">en acties </w:t>
+      </w:r>
+      <w:r>
+        <w:t xml:space="preserve">van de </w:t>
       </w:r>
       <w:r>
         <w:t xml:space="preserve">gebruiker of </w:t>
@@ -5759,13 +5714,7 @@
         <w:t>volledig overeenkom</w:t>
       </w:r>
       <w:r>
-        <w:t>t, wordt dit aangeduid als cross-</w:t>
-      </w:r>
-      <w:r>
-        <w:t>origin</w:t>
-      </w:r>
-      <w:r>
-        <w:t>.</w:t>
+        <w:t>t, wordt dit aangeduid als cross-origin.</w:t>
       </w:r>
     </w:p>
   </w:footnote>
@@ -11125,6 +11074,7 @@
   <w:style w:type="character" w:default="1" w:styleId="Standaardalinea-lettertype">
     <w:name w:val="Default Paragraph Font"/>
     <w:uiPriority w:val="1"/>
+    <w:semiHidden/>
     <w:unhideWhenUsed/>
   </w:style>
   <w:style w:type="table" w:default="1" w:styleId="Standaardtabel">

</xml_diff>

<commit_message>
Update official GDC .docx documents
Apply updates to two official Word documents in docs/Official: 25-26_GDC_Ian_Chains_Baute_6ICWE.docx and 25-26_GDC_Referentielijst_Ian_6ICWE.docx. These are binary .docx changes so diffs are not shown in plaintext.
</commit_message>
<xml_diff>
--- a/docs/Official/25-26_GDC_Ian_Chains_Baute_6ICWE.docx
+++ b/docs/Official/25-26_GDC_Ian_Chains_Baute_6ICWE.docx
@@ -18,7 +18,7 @@
           <w:noProof/>
         </w:rPr>
         <w:drawing>
-          <wp:anchor distT="0" distB="0" distL="114300" distR="114300" simplePos="0" relativeHeight="251658240" behindDoc="0" locked="0" layoutInCell="1" allowOverlap="1" wp14:anchorId="5268361A" wp14:editId="71B8849A">
+          <wp:anchor distT="0" distB="0" distL="114300" distR="114300" simplePos="0" relativeHeight="251658240" behindDoc="0" locked="0" layoutInCell="1" allowOverlap="1" wp14:anchorId="5268361A" wp14:editId="5BB96DFF">
             <wp:simplePos x="0" y="0"/>
             <wp:positionH relativeFrom="margin">
               <wp:align>center</wp:align>
@@ -612,7 +612,35 @@
           <w:rFonts w:cs="Arial"/>
           <w:szCs w:val="22"/>
         </w:rPr>
-        <w:t xml:space="preserve"> maar nooit echt stil gestaan bij de beveiliging van </w:t>
+        <w:t xml:space="preserve"> </w:t>
+      </w:r>
+      <w:r>
+        <w:rPr>
+          <w:rFonts w:cs="Arial"/>
+          <w:szCs w:val="22"/>
+        </w:rPr>
+        <w:t>voor het uitwisselen van data tussen de gebruiker en de app. M</w:t>
+      </w:r>
+      <w:r>
+        <w:rPr>
+          <w:rFonts w:cs="Arial"/>
+          <w:szCs w:val="22"/>
+        </w:rPr>
+        <w:t>aar</w:t>
+      </w:r>
+      <w:r>
+        <w:rPr>
+          <w:rFonts w:cs="Arial"/>
+          <w:szCs w:val="22"/>
+        </w:rPr>
+        <w:t xml:space="preserve"> ik heb</w:t>
+      </w:r>
+      <w:r>
+        <w:rPr>
+          <w:rFonts w:cs="Arial"/>
+          <w:szCs w:val="22"/>
+        </w:rPr>
+        <w:t xml:space="preserve"> nooit echt stil gestaan bij de beveiliging van </w:t>
       </w:r>
       <w:r>
         <w:rPr>
@@ -2420,6 +2448,9 @@
         <w:footnoteReference w:id="2"/>
       </w:r>
       <w:r>
+        <w:t xml:space="preserve"> met de focus op het uitwisselen van data tussen een gebruiker en een applicatie</w:t>
+      </w:r>
+      <w:r>
         <w:t xml:space="preserve">. De 3 beveiligingsproblemen die </w:t>
       </w:r>
       <w:r>
@@ -2456,7 +2487,25 @@
         <w:t>ste</w:t>
       </w:r>
       <w:r>
-        <w:t xml:space="preserve"> deel van dit werk is het theoretisch onderzoek </w:t>
+        <w:t xml:space="preserve"> deel van </w:t>
+      </w:r>
+      <w:r>
+        <w:t xml:space="preserve">elk </w:t>
+      </w:r>
+      <w:r>
+        <w:t>beveiligingsproble</w:t>
+      </w:r>
+      <w:r>
+        <w:t xml:space="preserve">em </w:t>
+      </w:r>
+      <w:r>
+        <w:t>is het theoretisch</w:t>
+      </w:r>
+      <w:r>
+        <w:t>e</w:t>
+      </w:r>
+      <w:r>
+        <w:t xml:space="preserve"> onderzoek </w:t>
       </w:r>
       <w:r>
         <w:t xml:space="preserve">naar de </w:t>
@@ -2465,7 +2514,13 @@
         <w:t xml:space="preserve">beveiligingsproblemen </w:t>
       </w:r>
       <w:r>
-        <w:t>door middel van een literatuur studie om beter te kunnen begrijpen wat deze beveiligingsproblemen nu precies betekenen en inhouden.</w:t>
+        <w:t xml:space="preserve">door middel van een literatuur studie om beter te kunnen begrijpen wat deze </w:t>
+      </w:r>
+      <w:r>
+        <w:t xml:space="preserve">problemen </w:t>
+      </w:r>
+      <w:r>
+        <w:t>nu precies betekenen en inhouden.</w:t>
       </w:r>
     </w:p>
     <w:p>
@@ -2577,7 +2632,13 @@
     </w:p>
     <w:p>
       <w:r>
-        <w:t xml:space="preserve">Het praktische gedeelte wordt volledig gedocumenteerd via een Github </w:t>
+        <w:t xml:space="preserve">Het praktische gedeelte wordt volledig gedocumenteerd via een </w:t>
+      </w:r>
+      <w:r>
+        <w:t>GitHub</w:t>
+      </w:r>
+      <w:r>
+        <w:t xml:space="preserve"> </w:t>
       </w:r>
       <w:r>
         <w:t>repository</w:t>
@@ -3455,7 +3516,7 @@
           <w:noProof/>
         </w:rPr>
         <w:drawing>
-          <wp:anchor distT="0" distB="0" distL="114300" distR="114300" simplePos="0" relativeHeight="251660288" behindDoc="0" locked="0" layoutInCell="1" allowOverlap="1" wp14:anchorId="152C802A" wp14:editId="2B0B75F2">
+          <wp:anchor distT="0" distB="0" distL="114300" distR="114300" simplePos="0" relativeHeight="251660288" behindDoc="0" locked="0" layoutInCell="1" allowOverlap="1" wp14:anchorId="152C802A" wp14:editId="3A57F75D">
             <wp:simplePos x="0" y="0"/>
             <wp:positionH relativeFrom="margin">
               <wp:align>left</wp:align>
@@ -3936,83 +3997,40 @@
     </w:p>
     <w:p>
       <w:pPr>
-        <w:pStyle w:val="Kop3"/>
-        <w:numPr>
-          <w:ilvl w:val="2"/>
-          <w:numId w:val="39"/>
-        </w:numPr>
-      </w:pPr>
-      <w:bookmarkStart w:id="14" w:name="_Toc218505651"/>
-      <w:r>
-        <w:lastRenderedPageBreak/>
-        <w:t>DOM-based XSS</w:t>
-      </w:r>
-      <w:bookmarkEnd w:id="14"/>
-    </w:p>
-    <w:p>
-      <w:r>
-        <w:t xml:space="preserve">DOM-based XSS komt niet voor bij API’s maar </w:t>
-      </w:r>
-      <w:r>
-        <w:t>in de</w:t>
-      </w:r>
-      <w:r>
-        <w:t xml:space="preserve"> frontend van een webapp</w:t>
-      </w:r>
-      <w:r>
-        <w:t xml:space="preserve"> omdat het alleen plaats vind</w:t>
-      </w:r>
-      <w:r>
-        <w:t>t</w:t>
-      </w:r>
-      <w:r>
-        <w:t xml:space="preserve"> in de browser van de gebruiker. Er is geen uitwisseling van kwaadaardige </w:t>
-      </w:r>
-      <w:r>
-        <w:t>code</w:t>
-      </w:r>
-      <w:r>
-        <w:t xml:space="preserve"> tussen de </w:t>
-      </w:r>
-      <w:r>
-        <w:t>client</w:t>
-      </w:r>
-      <w:r>
-        <w:t xml:space="preserve"> en de server.</w:t>
-      </w:r>
-      <w:r>
-        <w:t xml:space="preserve"> DOM verwijst naar de HTML structuur</w:t>
-      </w:r>
-      <w:r>
-        <w:t xml:space="preserve"> van een pagina, die </w:t>
-      </w:r>
-      <w:r>
-        <w:t xml:space="preserve">dan </w:t>
-      </w:r>
-      <w:r>
-        <w:t>gemanipuleerd wordt door XSS.</w:t>
-      </w:r>
-      <w:r>
-        <w:t xml:space="preserve"> DOM-based XSS komt voor doordat er een fout zit in de JavaScript van de frontend.</w:t>
-      </w:r>
-    </w:p>
-    <w:p>
-      <w:pPr>
         <w:pStyle w:val="Kop2"/>
         <w:numPr>
           <w:ilvl w:val="1"/>
           <w:numId w:val="39"/>
         </w:numPr>
       </w:pPr>
-      <w:bookmarkStart w:id="15" w:name="_Toc218505652"/>
-      <w:r>
+      <w:bookmarkStart w:id="14" w:name="_Toc218505652"/>
+      <w:r>
+        <w:lastRenderedPageBreak/>
         <w:t>Hoe XSS voorkomen?</w:t>
       </w:r>
-      <w:bookmarkEnd w:id="15"/>
-    </w:p>
-    <w:p>
-      <w:r>
-        <w:t>x</w:t>
+      <w:bookmarkEnd w:id="14"/>
+    </w:p>
+    <w:p>
+      <w:r>
+        <w:t>2 mogelijkheden uitleggen strip &amp; escape</w:t>
+      </w:r>
+    </w:p>
+    <w:p>
+      <w:r>
+        <w:t>Strip &amp; escape altijd whitelist gebruiken en geen blacklist</w:t>
+      </w:r>
+    </w:p>
+    <w:p>
+      <w:r>
+        <w:t>Vermijd functies zoals innerHTML, eval ...</w:t>
+      </w:r>
+      <w:r>
+        <w:t xml:space="preserve"> aan de frontend</w:t>
+      </w:r>
+    </w:p>
+    <w:p>
+      <w:r>
+        <w:t>Voor access token stealing via XSS te voorkomen zorgen dat je HTTP only cookies gebruikt</w:t>
       </w:r>
     </w:p>
     <w:p>
@@ -4023,15 +4041,39 @@
           <w:numId w:val="39"/>
         </w:numPr>
       </w:pPr>
-      <w:bookmarkStart w:id="16" w:name="_Toc218505653"/>
+      <w:bookmarkStart w:id="15" w:name="_Toc218505653"/>
       <w:r>
         <w:t>Praktisch</w:t>
       </w:r>
-      <w:bookmarkEnd w:id="16"/>
-    </w:p>
-    <w:p>
-      <w:r>
-        <w:t>X</w:t>
+      <w:bookmarkEnd w:id="15"/>
+    </w:p>
+    <w:p>
+      <w:r>
+        <w:t>Strip: nh3</w:t>
+      </w:r>
+      <w:r>
+        <w:t xml:space="preserve"> package</w:t>
+      </w:r>
+      <w:r>
+        <w:br/>
+        <w:t xml:space="preserve">Escape: html &amp; </w:t>
+      </w:r>
+      <w:r>
+        <w:t>markupsafe</w:t>
+      </w:r>
+      <w:r>
+        <w:t xml:space="preserve"> packages</w:t>
+      </w:r>
+    </w:p>
+    <w:p>
+      <w:r>
+        <w:t xml:space="preserve">Ik heb gekozen voor escape met </w:t>
+      </w:r>
+      <w:r>
+        <w:t>markupsafe</w:t>
+      </w:r>
+      <w:r>
+        <w:t xml:space="preserve"> voor de veilige versie van de API</w:t>
       </w:r>
     </w:p>
     <w:p>
@@ -4051,7 +4093,7 @@
           <w:szCs w:val="22"/>
         </w:rPr>
       </w:pPr>
-      <w:bookmarkStart w:id="17" w:name="_Toc218505654"/>
+      <w:bookmarkStart w:id="16" w:name="_Toc218505654"/>
       <w:r>
         <w:lastRenderedPageBreak/>
         <w:t>CSRF</w:t>
@@ -4069,7 +4111,7 @@
         </w:rPr>
         <w:t>Cross-Site Request Forgery</w:t>
       </w:r>
-      <w:bookmarkEnd w:id="17"/>
+      <w:bookmarkEnd w:id="16"/>
     </w:p>
     <w:p>
       <w:pPr>
@@ -4079,11 +4121,11 @@
           <w:numId w:val="39"/>
         </w:numPr>
       </w:pPr>
-      <w:bookmarkStart w:id="18" w:name="_Toc218505655"/>
+      <w:bookmarkStart w:id="17" w:name="_Toc218505655"/>
       <w:r>
         <w:t>Wat is CSRF?</w:t>
       </w:r>
-      <w:bookmarkEnd w:id="18"/>
+      <w:bookmarkEnd w:id="17"/>
     </w:p>
     <w:p>
       <w:r>
@@ -4120,10 +4162,16 @@
         <w:t>en</w:t>
       </w:r>
       <w:r>
+        <w:t xml:space="preserve"> meestal</w:t>
+      </w:r>
+      <w:r>
         <w:t xml:space="preserve"> </w:t>
       </w:r>
       <w:r>
-        <w:t>zonder een</w:t>
+        <w:t xml:space="preserve">zonder </w:t>
+      </w:r>
+      <w:r>
+        <w:t>enige</w:t>
       </w:r>
       <w:r>
         <w:t xml:space="preserve"> actie </w:t>
@@ -4147,7 +4195,7 @@
         <w:t>s</w:t>
       </w:r>
       <w:r>
-        <w:t xml:space="preserve"> kan er data worden gedeeld of aangepast worden</w:t>
+        <w:t xml:space="preserve"> kan er data gedeeld of aangepast worden</w:t>
       </w:r>
       <w:r>
         <w:t xml:space="preserve"> vanaf een andere site</w:t>
@@ -4162,6 +4210,8 @@
         <w:t>een request een kwaadaardig effect hebben.</w:t>
       </w:r>
     </w:p>
+    <w:p/>
+    <w:p/>
     <w:p>
       <w:pPr>
         <w:pStyle w:val="Ondertitel"/>
@@ -4176,16 +4226,16 @@
           <w:noProof/>
         </w:rPr>
         <w:drawing>
-          <wp:anchor distT="0" distB="0" distL="114300" distR="114300" simplePos="0" relativeHeight="251661312" behindDoc="0" locked="0" layoutInCell="1" allowOverlap="1" wp14:anchorId="0E71232A" wp14:editId="45E914AE">
+          <wp:anchor distT="0" distB="0" distL="114300" distR="114300" simplePos="0" relativeHeight="251661312" behindDoc="0" locked="0" layoutInCell="1" allowOverlap="1" wp14:anchorId="0E71232A" wp14:editId="3970D457">
             <wp:simplePos x="0" y="0"/>
             <wp:positionH relativeFrom="margin">
-              <wp:posOffset>-635</wp:posOffset>
+              <wp:align>left</wp:align>
             </wp:positionH>
             <wp:positionV relativeFrom="paragraph">
-              <wp:posOffset>198603</wp:posOffset>
+              <wp:posOffset>196850</wp:posOffset>
             </wp:positionV>
-            <wp:extent cx="5753100" cy="2157730"/>
-            <wp:effectExtent l="0" t="0" r="0" b="0"/>
+            <wp:extent cx="5981700" cy="2242185"/>
+            <wp:effectExtent l="0" t="0" r="0" b="5715"/>
             <wp:wrapTopAndBottom/>
             <wp:docPr id="271547590" name="Afbeelding 5"/>
             <wp:cNvGraphicFramePr>
@@ -4216,7 +4266,7 @@
                   <pic:spPr bwMode="auto">
                     <a:xfrm>
                       <a:off x="0" y="0"/>
-                      <a:ext cx="5753100" cy="2157730"/>
+                      <a:ext cx="5995239" cy="2247860"/>
                     </a:xfrm>
                     <a:prstGeom prst="rect">
                       <a:avLst/>
@@ -4234,6 +4284,9 @@
                 </pic:pic>
               </a:graphicData>
             </a:graphic>
+            <wp14:sizeRelH relativeFrom="margin">
+              <wp14:pctWidth>0</wp14:pctWidth>
+            </wp14:sizeRelH>
             <wp14:sizeRelV relativeFrom="margin">
               <wp14:pctHeight>0</wp14:pctHeight>
             </wp14:sizeRelV>
@@ -4257,29 +4310,48 @@
       </w:r>
     </w:p>
     <w:p>
-      <w:r>
-        <w:t xml:space="preserve">Figuur 3 </w:t>
-      </w:r>
-      <w:r>
-        <w:t>toont</w:t>
-      </w:r>
-      <w:r>
-        <w:t xml:space="preserve"> een POST reques</w:t>
-      </w:r>
-      <w:r>
-        <w:t>t</w:t>
-      </w:r>
-      <w:r>
-        <w:t xml:space="preserve"> van een API</w:t>
-      </w:r>
-      <w:r>
-        <w:t xml:space="preserve"> waarbij de gebruiker zich op de webapp </w:t>
+      <w:pPr>
+        <w:pStyle w:val="Bronnen"/>
+      </w:pPr>
+      <w:r>
+        <w:t>(</w:t>
       </w:r>
       <w:r>
         <w:rPr>
           <w:i/>
           <w:iCs/>
         </w:rPr>
+        <w:t>Cross-site Request Forgery (CSRF) - Security | MDN</w:t>
+      </w:r>
+      <w:r>
+        <w:t>, 2025)</w:t>
+      </w:r>
+    </w:p>
+    <w:p/>
+    <w:p>
+      <w:r>
+        <w:t xml:space="preserve">Figuur 3 </w:t>
+      </w:r>
+      <w:r>
+        <w:t>toont</w:t>
+      </w:r>
+      <w:r>
+        <w:t xml:space="preserve"> een POST reques</w:t>
+      </w:r>
+      <w:r>
+        <w:t>t</w:t>
+      </w:r>
+      <w:r>
+        <w:t xml:space="preserve"> van een API</w:t>
+      </w:r>
+      <w:r>
+        <w:t xml:space="preserve"> waarbij de gebruiker zich op de webapp </w:t>
+      </w:r>
+      <w:r>
+        <w:rPr>
+          <w:i/>
+          <w:iCs/>
+        </w:rPr>
         <w:t>my-bank.example.org</w:t>
       </w:r>
       <w:r>
@@ -4339,12 +4411,16 @@
       <w:r>
         <w:t xml:space="preserve"> request verwerkt en het geld overgeschreven.</w:t>
       </w:r>
+      <w:r>
+        <w:br w:type="page"/>
+      </w:r>
     </w:p>
     <w:p>
       <w:pPr>
         <w:pStyle w:val="Ondertitel"/>
       </w:pPr>
       <w:r>
+        <w:lastRenderedPageBreak/>
         <w:t>Figuur 4</w:t>
       </w:r>
     </w:p>
@@ -4371,9 +4447,9 @@
           <w:noProof/>
         </w:rPr>
         <w:drawing>
-          <wp:inline distT="0" distB="0" distL="0" distR="0" wp14:anchorId="51D0ECAB" wp14:editId="62FCC67C">
-            <wp:extent cx="5752422" cy="2538070"/>
-            <wp:effectExtent l="0" t="0" r="1270" b="0"/>
+          <wp:inline distT="0" distB="0" distL="0" distR="0" wp14:anchorId="51D0ECAB" wp14:editId="0DB30E32">
+            <wp:extent cx="5548113" cy="2447925"/>
+            <wp:effectExtent l="0" t="0" r="0" b="0"/>
             <wp:docPr id="1762731387" name="Afbeelding 6"/>
             <wp:cNvGraphicFramePr>
               <a:graphicFrameLocks xmlns:a="http://schemas.openxmlformats.org/drawingml/2006/main" noChangeAspect="1"/>
@@ -4403,7 +4479,7 @@
                   <pic:spPr bwMode="auto">
                     <a:xfrm>
                       <a:off x="0" y="0"/>
-                      <a:ext cx="5753100" cy="2538369"/>
+                      <a:ext cx="5579830" cy="2461919"/>
                     </a:xfrm>
                     <a:prstGeom prst="rect">
                       <a:avLst/>
@@ -4426,8 +4502,30 @@
       </w:r>
     </w:p>
     <w:p>
-      <w:r>
-        <w:lastRenderedPageBreak/>
+      <w:pPr>
+        <w:pStyle w:val="Bronnen"/>
+      </w:pPr>
+      <w:r>
+        <w:t>(</w:t>
+      </w:r>
+      <w:r>
+        <w:rPr>
+          <w:i/>
+          <w:iCs/>
+        </w:rPr>
+        <w:t>Cross-site Request Forgery (CSRF) - Security | MDN</w:t>
+      </w:r>
+      <w:r>
+        <w:t>, 2025)</w:t>
+      </w:r>
+    </w:p>
+    <w:p>
+      <w:pPr>
+        <w:pStyle w:val="Bronnen"/>
+      </w:pPr>
+    </w:p>
+    <w:p>
+      <w:r>
         <w:t>Figuur 4 toont dezelfde POST request als figuur 3 maar de gebruiker bevind</w:t>
       </w:r>
       <w:r>
@@ -4520,11 +4618,11 @@
           <w:numId w:val="39"/>
         </w:numPr>
       </w:pPr>
-      <w:bookmarkStart w:id="19" w:name="_Toc218505656"/>
+      <w:bookmarkStart w:id="18" w:name="_Toc218505656"/>
       <w:r>
         <w:t>Hoe CSRF voorkomen?</w:t>
       </w:r>
-      <w:bookmarkEnd w:id="19"/>
+      <w:bookmarkEnd w:id="18"/>
     </w:p>
     <w:p>
       <w:pPr>
@@ -4561,31 +4659,64 @@
         <w:t xml:space="preserve">er enkel gevoelige data tussen </w:t>
       </w:r>
       <w:r>
-        <w:t>een</w:t>
+        <w:t>webapps</w:t>
+      </w:r>
+      <w:r>
+        <w:t xml:space="preserve"> kan uitgewisseld worden als deze </w:t>
+      </w:r>
+      <w:r>
+        <w:t>s</w:t>
+      </w:r>
+      <w:r>
+        <w:t>ame-</w:t>
+      </w:r>
+      <w:r>
+        <w:t>o</w:t>
+      </w:r>
+      <w:r>
+        <w:t>rigin</w:t>
+      </w:r>
+      <w:r>
+        <w:rPr>
+          <w:rStyle w:val="Voetnootmarkering"/>
+        </w:rPr>
+        <w:footnoteReference w:id="3"/>
+      </w:r>
+      <w:r>
+        <w:t xml:space="preserve"> zijn.</w:t>
+      </w:r>
+      <w:r>
+        <w:t xml:space="preserve"> Als er niet wordt voldaan aan de SOP dan wordt de data van de </w:t>
+      </w:r>
+      <w:r>
+        <w:t xml:space="preserve">API </w:t>
+      </w:r>
+      <w:r>
+        <w:t>request geblokkeerd en kan de andere webapp deze data niet gebruiken/lezen.</w:t>
       </w:r>
       <w:r>
         <w:t xml:space="preserve"> </w:t>
       </w:r>
       <w:r>
-        <w:t>frontend</w:t>
-      </w:r>
-      <w:r>
-        <w:t xml:space="preserve"> en </w:t>
-      </w:r>
-      <w:r>
-        <w:t>een</w:t>
+        <w:t>Zodat</w:t>
       </w:r>
       <w:r>
         <w:t xml:space="preserve"> </w:t>
       </w:r>
       <w:r>
-        <w:t xml:space="preserve">API kan uitgewisseld worden als deze </w:t>
-      </w:r>
-      <w:r>
-        <w:t>s</w:t>
-      </w:r>
-      <w:r>
-        <w:t>ame-</w:t>
+        <w:t>een andere (kwaadaardige) webapp</w:t>
+      </w:r>
+      <w:r>
+        <w:t xml:space="preserve"> </w:t>
+      </w:r>
+      <w:r>
+        <w:t xml:space="preserve">die </w:t>
+      </w:r>
+      <w:r>
+        <w:t>c</w:t>
+      </w:r>
+      <w:r>
+        <w:t>ross-</w:t>
       </w:r>
       <w:r>
         <w:t>o</w:t>
@@ -4597,54 +4728,6 @@
         <w:rPr>
           <w:rStyle w:val="Voetnootmarkering"/>
         </w:rPr>
-        <w:footnoteReference w:id="3"/>
-      </w:r>
-      <w:r>
-        <w:t xml:space="preserve"> zijn.</w:t>
-      </w:r>
-      <w:r>
-        <w:t xml:space="preserve"> Als er niet wordt voldaan aan de SOP dan wordt de data van de </w:t>
-      </w:r>
-      <w:r>
-        <w:t xml:space="preserve">API </w:t>
-      </w:r>
-      <w:r>
-        <w:t>request geblokkeerd en kan de andere webapp deze data niet gebruiken/lezen.</w:t>
-      </w:r>
-      <w:r>
-        <w:t xml:space="preserve"> </w:t>
-      </w:r>
-      <w:r>
-        <w:t>Zodat</w:t>
-      </w:r>
-      <w:r>
-        <w:t xml:space="preserve"> </w:t>
-      </w:r>
-      <w:r>
-        <w:t>een andere (kwaadaardige) webapp</w:t>
-      </w:r>
-      <w:r>
-        <w:t xml:space="preserve"> </w:t>
-      </w:r>
-      <w:r>
-        <w:t xml:space="preserve">die </w:t>
-      </w:r>
-      <w:r>
-        <w:t>c</w:t>
-      </w:r>
-      <w:r>
-        <w:t>ross-</w:t>
-      </w:r>
-      <w:r>
-        <w:t>o</w:t>
-      </w:r>
-      <w:r>
-        <w:t>rigin</w:t>
-      </w:r>
-      <w:r>
-        <w:rPr>
-          <w:rStyle w:val="Voetnootmarkering"/>
-        </w:rPr>
         <w:footnoteReference w:id="4"/>
       </w:r>
       <w:r>
@@ -4657,10 +4740,10 @@
         <w:t xml:space="preserve">kan </w:t>
       </w:r>
       <w:r>
-        <w:t>lezen van een API</w:t>
-      </w:r>
-      <w:r>
-        <w:t xml:space="preserve"> van een andere webapp</w:t>
+        <w:t xml:space="preserve">lezen </w:t>
+      </w:r>
+      <w:r>
+        <w:t>van een andere webapp</w:t>
       </w:r>
       <w:r>
         <w:t>.</w:t>
@@ -4684,6 +4767,16 @@
       </w:r>
       <w:r>
         <w:t>.</w:t>
+      </w:r>
+    </w:p>
+    <w:p>
+      <w:r>
+        <w:lastRenderedPageBreak/>
+        <w:t>PREFLIGHTS UITLEGGEN WAT IS EEN SIMPLE REQUEST EN WAT NIET</w:t>
+      </w:r>
+      <w:r>
+        <w:br/>
+        <w:t>POST UITLEGGEN DAT HET EEN SIMPLE IS EN TOCH UITGEVOERD WORDT MAAR DATA NIET DOOR FRONTEND KAN VERWERKT WORDEN</w:t>
       </w:r>
     </w:p>
     <w:p>
@@ -4699,6 +4792,11 @@
       </w:r>
     </w:p>
     <w:p>
+      <w:r>
+        <w:t>Niet altijd het veiligste CSRF tokens worden verkozen bovenop dit</w:t>
+      </w:r>
+    </w:p>
+    <w:p>
       <w:pPr>
         <w:pStyle w:val="Kop3"/>
         <w:numPr>
@@ -4711,6 +4809,11 @@
       </w:r>
     </w:p>
     <w:p>
+      <w:r>
+        <w:t>Signed tokens</w:t>
+      </w:r>
+    </w:p>
+    <w:p>
       <w:pPr>
         <w:pStyle w:val="Kop2"/>
         <w:numPr>
@@ -4718,15 +4821,27 @@
           <w:numId w:val="39"/>
         </w:numPr>
       </w:pPr>
-      <w:bookmarkStart w:id="20" w:name="_Toc218505657"/>
+      <w:bookmarkStart w:id="19" w:name="_Toc218505657"/>
       <w:r>
         <w:t>Praktisch</w:t>
       </w:r>
-      <w:bookmarkEnd w:id="20"/>
-    </w:p>
-    <w:p>
-      <w:r>
-        <w:t>x</w:t>
+      <w:bookmarkEnd w:id="19"/>
+    </w:p>
+    <w:p>
+      <w:r>
+        <w:t>X</w:t>
+      </w:r>
+    </w:p>
+    <w:p/>
+    <w:p>
+      <w:r>
+        <w:t xml:space="preserve">Cookies </w:t>
+      </w:r>
+      <w:r>
+        <w:t xml:space="preserve">met samesite attribuut </w:t>
+      </w:r>
+      <w:r>
+        <w:t>eerst uitleggen voor CSRF tokens</w:t>
       </w:r>
     </w:p>
     <w:p>
@@ -4737,11 +4852,11 @@
           <w:numId w:val="39"/>
         </w:numPr>
       </w:pPr>
-      <w:bookmarkStart w:id="21" w:name="_Toc218505658"/>
+      <w:bookmarkStart w:id="20" w:name="_Toc218505658"/>
       <w:r>
         <w:t>Improper Input Validation</w:t>
       </w:r>
-      <w:bookmarkEnd w:id="21"/>
+      <w:bookmarkEnd w:id="20"/>
     </w:p>
     <w:p/>
     <w:p/>
@@ -4771,13 +4886,13 @@
       <w:pPr>
         <w:pStyle w:val="Kop1"/>
       </w:pPr>
-      <w:bookmarkStart w:id="22" w:name="_Toc218505659"/>
+      <w:bookmarkStart w:id="21" w:name="_Toc218505659"/>
       <w:r>
         <w:lastRenderedPageBreak/>
         <w:t>Besluit</w:t>
       </w:r>
       <w:bookmarkEnd w:id="10"/>
-      <w:bookmarkEnd w:id="22"/>
+      <w:bookmarkEnd w:id="21"/>
     </w:p>
     <w:p>
       <w:pPr>
@@ -4892,18 +5007,24 @@
       <w:pPr>
         <w:pStyle w:val="Kop1"/>
       </w:pPr>
-      <w:bookmarkStart w:id="23" w:name="_Toc196152199"/>
-      <w:bookmarkStart w:id="24" w:name="_Toc218505660"/>
+      <w:bookmarkStart w:id="22" w:name="_Toc196152199"/>
+      <w:bookmarkStart w:id="23" w:name="_Toc218505660"/>
       <w:r>
         <w:lastRenderedPageBreak/>
         <w:t>Bijlagen</w:t>
       </w:r>
+      <w:bookmarkEnd w:id="22"/>
       <w:bookmarkEnd w:id="23"/>
-      <w:bookmarkEnd w:id="24"/>
-    </w:p>
-    <w:p>
-      <w:r>
-        <w:t xml:space="preserve">Voor het praktische gedeelte van dit onderzoek is er gebruik gemaakt van een Github </w:t>
+    </w:p>
+    <w:p>
+      <w:r>
+        <w:t xml:space="preserve">Voor het praktische gedeelte van dit onderzoek is er gebruik gemaakt van een </w:t>
+      </w:r>
+      <w:r>
+        <w:t>GitHub</w:t>
+      </w:r>
+      <w:r>
+        <w:t xml:space="preserve"> </w:t>
       </w:r>
       <w:r>
         <w:t>r</w:t>
@@ -4921,7 +5042,13 @@
         <w:t xml:space="preserve"> en documentatie</w:t>
       </w:r>
       <w:r>
-        <w:t xml:space="preserve"> overzichtelijk te kunnen bijhouden. De link naar de Github </w:t>
+        <w:t xml:space="preserve"> overzichtelijk te kunnen bijhouden. De link naar de </w:t>
+      </w:r>
+      <w:r>
+        <w:t>GitHub</w:t>
+      </w:r>
+      <w:r>
+        <w:t xml:space="preserve"> </w:t>
       </w:r>
       <w:r>
         <w:t>r</w:t>
@@ -4934,7 +5061,19 @@
           <w:rPr>
             <w:rStyle w:val="Hyperlink"/>
           </w:rPr>
-          <w:t>https://github.com/GO-atheneum-De-Tandem/GDC-Ian-2025-2026</w:t>
+          <w:t>https://</w:t>
+        </w:r>
+        <w:r>
+          <w:rPr>
+            <w:rStyle w:val="Hyperlink"/>
+          </w:rPr>
+          <w:t>GitHub</w:t>
+        </w:r>
+        <w:r>
+          <w:rPr>
+            <w:rStyle w:val="Hyperlink"/>
+          </w:rPr>
+          <w:t>.com/GO-atheneum-De-Tandem/GDC-Ian-2025-2026</w:t>
         </w:r>
       </w:hyperlink>
     </w:p>
@@ -5069,22 +5208,40 @@
       </w:tr>
     </w:tbl>
     <w:p>
-      <w:bookmarkStart w:id="25" w:name="_Toc196152200"/>
+      <w:bookmarkStart w:id="24" w:name="_Toc196152200"/>
     </w:p>
     <w:p>
       <w:pPr>
         <w:pStyle w:val="Kop1"/>
       </w:pPr>
-      <w:bookmarkStart w:id="26" w:name="_Toc218505661"/>
+      <w:bookmarkStart w:id="25" w:name="_Toc218505661"/>
       <w:r>
         <w:t>Referentielijst</w:t>
       </w:r>
+      <w:bookmarkEnd w:id="24"/>
       <w:bookmarkEnd w:id="25"/>
-      <w:bookmarkEnd w:id="26"/>
-    </w:p>
-    <w:p>
-      <w:r>
-        <w:t>De referentielijst is opgenomen in een apart bestand om dit onderzoek overzichtelijk te houden. Dit bestand kan je terug vinden in de meegeleverde bijlagen.</w:t>
+    </w:p>
+    <w:p>
+      <w:r>
+        <w:t>De referentielijst is</w:t>
+      </w:r>
+      <w:r>
+        <w:t xml:space="preserve"> </w:t>
+      </w:r>
+      <w:r>
+        <w:t xml:space="preserve">opgenomen in een apart bestand om dit onderzoek overzichtelijk te houden. </w:t>
+      </w:r>
+      <w:r>
+        <w:t xml:space="preserve">De </w:t>
+      </w:r>
+      <w:r>
+        <w:t>referentielijst</w:t>
+      </w:r>
+      <w:r>
+        <w:t xml:space="preserve"> is ook gesorteerd per onderdeel van dit werk. </w:t>
+      </w:r>
+      <w:r>
+        <w:t>Dit bestand kan je terug vinden in de meegeleverde bijlagen.</w:t>
       </w:r>
     </w:p>
     <w:p>
@@ -11074,7 +11231,6 @@
   <w:style w:type="character" w:default="1" w:styleId="Standaardalinea-lettertype">
     <w:name w:val="Default Paragraph Font"/>
     <w:uiPriority w:val="1"/>
-    <w:semiHidden/>
     <w:unhideWhenUsed/>
   </w:style>
   <w:style w:type="table" w:default="1" w:styleId="Standaardtabel">

</xml_diff>